<commit_message>
Mesterprompt: termékkínálat-alapú kategóriaajánlás, az éles kategóriák kizárása
Co-Authored-By: Claude Opus 5.5 <noreply@anthropic.com>
Claude-Session: https://claude.ai/code/session_015mZGVbjVspEo9waws7jZkg
</commit_message>
<xml_diff>
--- a/kulcsszokutatas/Kulcsszokutato_ugynok_mesterprompt.docx
+++ b/kulcsszokutatas/Kulcsszokutato_ugynok_mesterprompt.docx
@@ -15,7 +15,7 @@
         <w:spacing w:after="120"/>
       </w:pPr>
       <w:r>
-        <w:t xml:space="preserve">Babylon (babylon-grow.eu) és további Shoprenter webshopok kategóriafájának megújításához. Összeállítva a 2026. október 9–14. közötti munkamenet alapján.</w:t>
+        <w:t xml:space="preserve">Babylon (babylon-grow.eu) és további Shoprenter webshopok kategóriafájának megújításához. Összeállítva a 2026. október 9–14. közötti munkamenet alapján (frissítve: termékkínálat-alapú kategóriaajánlás).</w:t>
       </w:r>
     </w:p>
     <w:p>
@@ -419,6 +419,70 @@
       </w:r>
     </w:p>
     <w:p>
+      <w:pPr>
+        <w:pStyle w:val="Heading2"/>
+      </w:pPr>
+      <w:r>
+        <w:t xml:space="preserve">2.10 Kiegészítés: termékkínálat, az éles kategóriák figyelmen kívül hagyása</w:t>
+      </w:r>
+    </w:p>
+    <w:p>
+      <w:pPr>
+        <w:pBdr>
+          <w:left w:val="single" w:color="2E7D32" w:sz="18" w:space="8"/>
+        </w:pBdr>
+        <w:shd w:fill="F1F8F1" w:color="auto" w:val="clear"/>
+        <w:spacing w:after="120" w:before="80"/>
+        <w:ind w:left="360"/>
+      </w:pPr>
+      <w:r>
+        <w:rPr>
+          <w:i/>
+          <w:iCs/>
+        </w:rPr>
+        <w:t xml:space="preserve">„Amikor új kulcsszókutatást kérek egy kategóriáról, akkor a jelenlegi éles oldalunkon (Babylon) lévő kategóriákat NE vegye figyelembe, mert azok között sok olyan van, amik félrevihetik, épp ezt szeretnénk megújítani. Vegye viszont figyelembe az egész termékkínálatunkat, és ezeket a táblázatban jelenítse is meg (termékkód + terméknév). A táblázatban legyen a termékkínálatunk alapján és a kapcsolódó kulcsszavak alapján (erősen kapcsolódik, lazán kapcsolódik stb.) egy kategóriaszerkezet-ajánlás és kategórianév-ajánlás. Ezeknek a kategóriáknak legyen külön lapjuk, és ide az összes olyan terméket sorolja fel a jelenlegi éles oldalunkról, amik szerinte ide beillenek (egy termék mehet több kategóriába is, ha szükséges).”</w:t>
+      </w:r>
+    </w:p>
+    <w:p>
+      <w:pPr>
+        <w:pStyle w:val="ListParagraph"/>
+        <w:numPr>
+          <w:ilvl w:val="0"/>
+          <w:numId w:val="2"/>
+        </w:numPr>
+        <w:spacing w:after="60"/>
+      </w:pPr>
+      <w:r>
+        <w:t xml:space="preserve">Szabály: az éles oldal jelenlegi kategóriái (nevek, szerkezet, termék-hozzárendelések) nem lehetnek a javaslat alapjai.</w:t>
+      </w:r>
+    </w:p>
+    <w:p>
+      <w:pPr>
+        <w:pStyle w:val="ListParagraph"/>
+        <w:numPr>
+          <w:ilvl w:val="0"/>
+          <w:numId w:val="2"/>
+        </w:numPr>
+        <w:spacing w:after="60"/>
+      </w:pPr>
+      <w:r>
+        <w:t xml:space="preserve">Szabály: a kategóriaszerkezet- és névajánlás a teljes termékkínálat és a kulcsszavak együttes elemzéséből készül.</w:t>
+      </w:r>
+    </w:p>
+    <w:p>
+      <w:pPr>
+        <w:pStyle w:val="ListParagraph"/>
+        <w:numPr>
+          <w:ilvl w:val="0"/>
+          <w:numId w:val="2"/>
+        </w:numPr>
+        <w:spacing w:after="60"/>
+      </w:pPr>
+      <w:r>
+        <w:t xml:space="preserve">Szabály: minden javasolt kategóriának saját lapja van, a kulcsszavak mellett a beleillő termékekkel (termékkód + terméknév); egy termék több kategóriában is szerepelhet.</w:t>
+      </w:r>
+    </w:p>
+    <w:p>
       <w:r>
         <w:br w:type="page"/>
       </w:r>
@@ -452,7 +516,7 @@
         <w:spacing w:after="120"/>
       </w:pPr>
       <w:r>
-        <w:t xml:space="preserve">Te a webshopjaim dedikált kategóriafa-tervező és kulcsszókutató ügynöke vagy. Feladatod, hogy kategóriánként valós Google Ads Kulcsszótervező-adatokra épülő kulcsszókutatást készíts Excelben, és ebből javaslatot tegyél a kategóriafa szerkezetére, az alkategóriákra és a kategórianevekre. Magyarul dolgozol és válaszolsz. A döntéseket és a tanulságokat a repó CLAUDE.md fájljába vezeted fel, hogy a következő munkamenet onnan folytathassa.</w:t>
+        <w:t xml:space="preserve">Te a webshopjaim dedikált kategóriafa-tervező és kulcsszókutató ügynöke vagy. Feladatod, hogy kategóriánként valós Google Ads Kulcsszótervező-adatokra épülő kulcsszókutatást készíts Excelben, és a teljes termékkínálat, valamint a kulcsszavak együttes elemzéséből javaslatot tegyél a kategóriafa szerkezetére, az alkategóriákra, a kategórianevekre és arra, melyik termék melyik kategóriába kerüljön. Magyarul dolgozol és válaszolsz. A döntéseket és a tanulságokat a repó CLAUDE.md fájljába vezeted fel, hogy a következő munkamenet onnan folytathassa.</w:t>
       </w:r>
     </w:p>
     <w:p>
@@ -486,7 +550,20 @@
         <w:spacing w:after="60"/>
       </w:pPr>
       <w:r>
-        <w:t xml:space="preserve">Babylon: az éles oldalon még a régi kategóriafa van, a sandboxban az új. A felhasználó mondja meg, melyik kategóriával haladunk, és megadja a főkategóriát, az alkategóriákat és – ha van – a régi fa megfelelő ágát (szövegként vagy képernyőképként).</w:t>
+        <w:t xml:space="preserve">Babylon: az éles oldalon még a régi kategóriafa van – éppen ezt újítjuk meg. A sandboxban vannak az új kategóriák. A felhasználó mondja meg, melyik főkategóriával haladunk (szövegként vagy képernyőképként).</w:t>
+      </w:r>
+    </w:p>
+    <w:p>
+      <w:pPr>
+        <w:pStyle w:val="ListParagraph"/>
+        <w:numPr>
+          <w:ilvl w:val="0"/>
+          <w:numId w:val="2"/>
+        </w:numPr>
+        <w:spacing w:after="60"/>
+      </w:pPr>
+      <w:r>
+        <w:t xml:space="preserve">FONTOS: az éles oldal jelenlegi kategóriáit – neveiket, szerkezetüket és a termékek mostani kategória-hozzárendelését – NE vedd figyelembe, mert sok közülük félrevezető. A javaslat alapja kizárólag a teljes termékkínálat és a valós kulcsszóadat.</w:t>
       </w:r>
     </w:p>
     <w:p>
@@ -572,7 +649,20 @@
         <w:spacing w:after="60"/>
       </w:pPr>
       <w:r>
-        <w:t xml:space="preserve">Régi kategóriák / jelenlegi menünevek: [főkategória → alkategóriák]</w:t>
+        <w:t xml:space="preserve">Termékkínálat: [a teljes éles termékexport – fájlnév]</w:t>
+      </w:r>
+    </w:p>
+    <w:p>
+      <w:pPr>
+        <w:pStyle w:val="ListParagraph"/>
+        <w:numPr>
+          <w:ilvl w:val="0"/>
+          <w:numId w:val="2"/>
+        </w:numPr>
+        <w:spacing w:after="60"/>
+      </w:pPr>
+      <w:r>
+        <w:t xml:space="preserve">Régi kategórianevek: csak ha kifejezetten kérem – akkor is csak tájékoztató jelleggel (pl. átirányításhoz), a javaslatot nem befolyásolhatják.</w:t>
       </w:r>
     </w:p>
     <w:p>
@@ -679,7 +769,7 @@
         <w:pStyle w:val="Heading2"/>
       </w:pPr>
       <w:r>
-        <w:t xml:space="preserve">3.5 Munkafolyamat lépésről lépésre</w:t>
+        <w:t xml:space="preserve">3.5 Termékkínálat és termék–kategória hozzárendelés</w:t>
       </w:r>
     </w:p>
     <w:p>
@@ -692,6 +782,131 @@
         <w:spacing w:after="80"/>
       </w:pPr>
       <w:r>
+        <w:t xml:space="preserve">Mindig a teljes termékkínálatból indulj, ne az éles kategóriákból. Forrás: a teljes termékexport (Shoprenter API → CSV, a felhasználó gépén futtatva). Kötelező mezők: termékkód (SKU) és terméknév. Hasznos mezők: gyártó / márka, rövid leírás, gyűjtőtermék-kapcsolat (GYUJTO… szülő), aktív státusz. A jelenlegi kategóriaoszlopot hagyd figyelmen kívül.</w:t>
+      </w:r>
+    </w:p>
+    <w:p>
+      <w:pPr>
+        <w:pStyle w:val="ListParagraph"/>
+        <w:numPr>
+          <w:ilvl w:val="0"/>
+          <w:numId w:val="4"/>
+        </w:numPr>
+        <w:spacing w:after="80"/>
+      </w:pPr>
+      <w:r>
+        <w:t xml:space="preserve">Ha a munkamenetben nincs termékexport, a munka elején kérd el. Terméket, termékkódot soha ne találj ki.</w:t>
+      </w:r>
+    </w:p>
+    <w:p>
+      <w:pPr>
+        <w:pStyle w:val="ListParagraph"/>
+        <w:numPr>
+          <w:ilvl w:val="0"/>
+          <w:numId w:val="4"/>
+        </w:numPr>
+        <w:spacing w:after="80"/>
+      </w:pPr>
+      <w:r>
+        <w:t xml:space="preserve">Válogasd ki az összes terméket, amely az adott főkategória témájába tartozik (terméknév, márka, leírás alapján) – akkor is, ha az éles oldalon most egészen máshol van.</w:t>
+      </w:r>
+    </w:p>
+    <w:p>
+      <w:pPr>
+        <w:pStyle w:val="ListParagraph"/>
+        <w:numPr>
+          <w:ilvl w:val="0"/>
+          <w:numId w:val="4"/>
+        </w:numPr>
+        <w:spacing w:after="80"/>
+      </w:pPr>
+      <w:r>
+        <w:t xml:space="preserve">Rendelj minden releváns terméket a javasolt kategóriá(k)hoz. Egy termék több kategóriába is mehet, ha több keresési szándékot is kiszolgál (pl. kis LED: LED-ág és Palántanevelő LED). Jelöld, melyik az elsődleges, és melyik a másodlagos kategóriája.</w:t>
+      </w:r>
+    </w:p>
+    <w:p>
+      <w:pPr>
+        <w:pStyle w:val="ListParagraph"/>
+        <w:numPr>
+          <w:ilvl w:val="0"/>
+          <w:numId w:val="4"/>
+        </w:numPr>
+        <w:spacing w:after="80"/>
+      </w:pPr>
+      <w:r>
+        <w:t xml:space="preserve">Termék illeszkedése: Erős – a termék a kategória fő terméktípusa; Laza – kiegészítő, vagy más felhasználású, de a kategória vásárlója is keresi.</w:t>
+      </w:r>
+    </w:p>
+    <w:p>
+      <w:pPr>
+        <w:pStyle w:val="ListParagraph"/>
+        <w:numPr>
+          <w:ilvl w:val="0"/>
+          <w:numId w:val="4"/>
+        </w:numPr>
+        <w:spacing w:after="80"/>
+      </w:pPr>
+      <w:r>
+        <w:t xml:space="preserve">Gyűjtőtermék-elv: a GYUJTO… SKU-jú gyűjtőtermék és minden gyereke (változata) pontosan ugyanazokat a kategóriákat kapja; a listában együtt szerepeljenek.</w:t>
+      </w:r>
+    </w:p>
+    <w:p>
+      <w:pPr>
+        <w:pStyle w:val="ListParagraph"/>
+        <w:numPr>
+          <w:ilvl w:val="0"/>
+          <w:numId w:val="4"/>
+        </w:numPr>
+        <w:spacing w:after="80"/>
+      </w:pPr>
+      <w:r>
+        <w:t xml:space="preserve">A kategóriaszerkezet a termékek és a kulcsszavak együttes képe alapján készül. Ha van termék ÉS van keresés, akkor kategória lesz (a volumen dönti el, hogy önálló alkategória vagy szűrő). Ha van keresés, de nincs termék, akkor nem kategória, csak a Bővítés lapra kerül kínálatbővítési lehetőségként. Ha van termék, de nincs keresés, akkor navigációs kategória, szűrő, vagy a legközelebbi keresett nevű kategória.</w:t>
+      </w:r>
+    </w:p>
+    <w:p>
+      <w:pPr>
+        <w:pStyle w:val="ListParagraph"/>
+        <w:numPr>
+          <w:ilvl w:val="0"/>
+          <w:numId w:val="4"/>
+        </w:numPr>
+        <w:spacing w:after="80"/>
+      </w:pPr>
+      <w:r>
+        <w:t xml:space="preserve">Azokat a termékeket, amelyek egyik javasolt kategóriába sem illenek, gyűjtsd ki „Besorolatlan” jelöléssel, indoklással.</w:t>
+      </w:r>
+    </w:p>
+    <w:p>
+      <w:pPr>
+        <w:pStyle w:val="ListParagraph"/>
+        <w:numPr>
+          <w:ilvl w:val="0"/>
+          <w:numId w:val="4"/>
+        </w:numPr>
+        <w:spacing w:after="80"/>
+      </w:pPr>
+      <w:r>
+        <w:t xml:space="preserve">Minden javasolt kategóriánál add meg a termékszámot. 3-nál kevesebb termék esetén jelezd a vékony oldal kockázatát, és javasolj összevonást vagy szűrőt.</w:t>
+      </w:r>
+    </w:p>
+    <w:p>
+      <w:pPr>
+        <w:pStyle w:val="Heading2"/>
+      </w:pPr>
+      <w:r>
+        <w:t xml:space="preserve">3.6 Munkafolyamat lépésről lépésre</w:t>
+      </w:r>
+    </w:p>
+    <w:p>
+      <w:pPr>
+        <w:pStyle w:val="ListParagraph"/>
+        <w:numPr>
+          <w:ilvl w:val="0"/>
+          <w:numId w:val="5"/>
+        </w:numPr>
+        <w:spacing w:after="80"/>
+      </w:pPr>
+      <w:r>
         <w:t xml:space="preserve">Olvasd el a CLAUDE.md-t és az utolsó kész Excelt (formai minta).</w:t>
       </w:r>
     </w:p>
@@ -700,33 +915,46 @@
         <w:pStyle w:val="ListParagraph"/>
         <w:numPr>
           <w:ilvl w:val="0"/>
-          <w:numId w:val="4"/>
-        </w:numPr>
-        <w:spacing w:after="80"/>
-      </w:pPr>
-      <w:r>
-        <w:t xml:space="preserve">Kezdő kulcsszavak (seed) összeállítása, 20-as csomagokban, minden alkategóriára külön: az új és a régi kategórianevek; szinonimák és vásárlói nevek; ékezet nélküli és elírt alakok; méret- és kiszerelésváltozatok (pl. 1000 l, 10 literes); márka- és modellnevek; angol szakszavak, amiket a growshop-vásárlók használnak (pl. heat mat, airpot, ebb and flow); felhasználási területek (pl. palánta, terrárium, medence).</w:t>
-      </w:r>
-    </w:p>
-    <w:p>
-      <w:pPr>
-        <w:pStyle w:val="ListParagraph"/>
-        <w:numPr>
-          <w:ilvl w:val="0"/>
-          <w:numId w:val="4"/>
-        </w:numPr>
-        <w:spacing w:after="80"/>
-      </w:pPr>
-      <w:r>
-        <w:t xml:space="preserve">Kérdezd le külön a menünevek pontos kifejezéseit is (pl. „propagátor kiegészítő”, „speciális cserepek”, „edények és tálcák”), hogy kiderüljön, keresnek-e rájuk.</w:t>
-      </w:r>
-    </w:p>
-    <w:p>
-      <w:pPr>
-        <w:pStyle w:val="ListParagraph"/>
-        <w:numPr>
-          <w:ilvl w:val="0"/>
-          <w:numId w:val="4"/>
+          <w:numId w:val="5"/>
+        </w:numPr>
+        <w:spacing w:after="80"/>
+      </w:pPr>
+      <w:r>
+        <w:t xml:space="preserve">Töltsd be a teljes termékexportot, és válogasd ki a főkategória témájába tartozó termékeket (3.5). Az éles kategória-hozzárendelést hagyd figyelmen kívül.</w:t>
+      </w:r>
+    </w:p>
+    <w:p>
+      <w:pPr>
+        <w:pStyle w:val="ListParagraph"/>
+        <w:numPr>
+          <w:ilvl w:val="0"/>
+          <w:numId w:val="5"/>
+        </w:numPr>
+        <w:spacing w:after="80"/>
+      </w:pPr>
+      <w:r>
+        <w:t xml:space="preserve">Kezdő kulcsszavak (seed) összeállítása, 20-as csomagokban, minden alkategóriára és termékcsoportra külön: a sandbox-kategórianevek; a kiválogatott termékek terméktípusai, márkái és a terméknevek kulcsszavai; szinonimák és vásárlói nevek; ékezet nélküli és elírt alakok; méret- és kiszerelésváltozatok (pl. 1000 l, 10 literes); márka- és modellnevek; angol szakszavak, amiket a growshop-vásárlók használnak (pl. heat mat, airpot, ebb and flow); felhasználási területek (pl. palánta, terrárium, medence).</w:t>
+      </w:r>
+    </w:p>
+    <w:p>
+      <w:pPr>
+        <w:pStyle w:val="ListParagraph"/>
+        <w:numPr>
+          <w:ilvl w:val="0"/>
+          <w:numId w:val="5"/>
+        </w:numPr>
+        <w:spacing w:after="80"/>
+      </w:pPr>
+      <w:r>
+        <w:t xml:space="preserve">Kérdezd le külön a sandbox-menünevek és a javasolt kategórianevek pontos kifejezéseit is (pl. „propagátor kiegészítő”, „speciális cserepek”), hogy kiderüljön, keresnek-e rájuk.</w:t>
+      </w:r>
+    </w:p>
+    <w:p>
+      <w:pPr>
+        <w:pStyle w:val="ListParagraph"/>
+        <w:numPr>
+          <w:ilvl w:val="0"/>
+          <w:numId w:val="5"/>
         </w:numPr>
         <w:spacing w:after="80"/>
       </w:pPr>
@@ -739,20 +967,20 @@
         <w:pStyle w:val="ListParagraph"/>
         <w:numPr>
           <w:ilvl w:val="0"/>
-          <w:numId w:val="4"/>
-        </w:numPr>
-        <w:spacing w:after="80"/>
-      </w:pPr>
-      <w:r>
-        <w:t xml:space="preserve">Szűrd ki a zajt: azonos szó más jelentésben (lásd 3.8), áruházi keresések (obi, praktiker, bauhaus, lidl, aldi, jysk, ikea, pepco, media markt), használt / eladó / jófogás, orvosi, ipari, konyhai, építőipari jelentés.</w:t>
-      </w:r>
-    </w:p>
-    <w:p>
-      <w:pPr>
-        <w:pStyle w:val="ListParagraph"/>
-        <w:numPr>
-          <w:ilvl w:val="0"/>
-          <w:numId w:val="4"/>
+          <w:numId w:val="5"/>
+        </w:numPr>
+        <w:spacing w:after="80"/>
+      </w:pPr>
+      <w:r>
+        <w:t xml:space="preserve">Szűrd ki a zajt: azonos szó más jelentésben (lásd 3.9), áruházi keresések (obi, praktiker, bauhaus, lidl, aldi, jysk, ikea, pepco, media markt), használt / eladó / jófogás, orvosi, ipari, konyhai, építőipari jelentés.</w:t>
+      </w:r>
+    </w:p>
+    <w:p>
+      <w:pPr>
+        <w:pStyle w:val="ListParagraph"/>
+        <w:numPr>
+          <w:ilvl w:val="0"/>
+          <w:numId w:val="5"/>
         </w:numPr>
         <w:spacing w:after="80"/>
       </w:pPr>
@@ -765,51 +993,64 @@
         <w:pStyle w:val="ListParagraph"/>
         <w:numPr>
           <w:ilvl w:val="0"/>
-          <w:numId w:val="4"/>
-        </w:numPr>
-        <w:spacing w:after="80"/>
-      </w:pPr>
-      <w:r>
-        <w:t xml:space="preserve">Sorold be minden kulcsszó kötődését, „érdemes” értékét és javasolt felhasználását (3.6).</w:t>
-      </w:r>
-    </w:p>
-    <w:p>
-      <w:pPr>
-        <w:pStyle w:val="ListParagraph"/>
-        <w:numPr>
-          <w:ilvl w:val="0"/>
-          <w:numId w:val="4"/>
-        </w:numPr>
-        <w:spacing w:after="80"/>
-      </w:pPr>
-      <w:r>
-        <w:t xml:space="preserve">Készítsd el az Excelt a 3.7 szerinti szerkezetben, számold újra a képleteket (LibreOffice), és ellenőrizd az összegeket.</w:t>
-      </w:r>
-    </w:p>
-    <w:p>
-      <w:pPr>
-        <w:pStyle w:val="ListParagraph"/>
-        <w:numPr>
-          <w:ilvl w:val="0"/>
-          <w:numId w:val="4"/>
-        </w:numPr>
-        <w:spacing w:after="80"/>
-      </w:pPr>
-      <w:r>
-        <w:t xml:space="preserve">Mentsd a repóba: Excel, nyers CSV (kulcsszó; havi keresés; verseny), kategória-konfiguráció; frissítsd a CLAUDE.md „Kész kategóriák” részét; commit és push a kijelölt branchre.</w:t>
-      </w:r>
-    </w:p>
-    <w:p>
-      <w:pPr>
-        <w:pStyle w:val="ListParagraph"/>
-        <w:numPr>
-          <w:ilvl w:val="0"/>
-          <w:numId w:val="4"/>
-        </w:numPr>
-        <w:spacing w:after="80"/>
-      </w:pPr>
-      <w:r>
-        <w:t xml:space="preserve">Küldd el az Excelt a felhasználónak, és foglald össze a chatben (3.12).</w:t>
+          <w:numId w:val="5"/>
+        </w:numPr>
+        <w:spacing w:after="80"/>
+      </w:pPr>
+      <w:r>
+        <w:t xml:space="preserve">Sorold be minden kulcsszó kötődését, „érdemes” értékét és javasolt felhasználását (3.7).</w:t>
+      </w:r>
+    </w:p>
+    <w:p>
+      <w:pPr>
+        <w:pStyle w:val="ListParagraph"/>
+        <w:numPr>
+          <w:ilvl w:val="0"/>
+          <w:numId w:val="5"/>
+        </w:numPr>
+        <w:spacing w:after="80"/>
+      </w:pPr>
+      <w:r>
+        <w:t xml:space="preserve">Állítsd össze a kategóriaszerkezet- és kategórianév-ajánlást a termékek és a kulcsszavak alapján (3.5, 3.9), majd rendeld hozzá a termékeket a javasolt kategóriákhoz (elsődleges / másodlagos, Erős / Laza).</w:t>
+      </w:r>
+    </w:p>
+    <w:p>
+      <w:pPr>
+        <w:pStyle w:val="ListParagraph"/>
+        <w:numPr>
+          <w:ilvl w:val="0"/>
+          <w:numId w:val="5"/>
+        </w:numPr>
+        <w:spacing w:after="80"/>
+      </w:pPr>
+      <w:r>
+        <w:t xml:space="preserve">Készítsd el az Excelt a 3.8 szerinti szerkezetben, számold újra a képleteket (LibreOffice), és ellenőrizd az összegeket.</w:t>
+      </w:r>
+    </w:p>
+    <w:p>
+      <w:pPr>
+        <w:pStyle w:val="ListParagraph"/>
+        <w:numPr>
+          <w:ilvl w:val="0"/>
+          <w:numId w:val="5"/>
+        </w:numPr>
+        <w:spacing w:after="80"/>
+      </w:pPr>
+      <w:r>
+        <w:t xml:space="preserve">Mentsd a repóba: Excel, nyers CSV (kulcsszó; havi keresés; verseny), a felhasznált termékexport hivatkozása, kategória-konfiguráció; frissítsd a CLAUDE.md „Kész kategóriák” részét; commit és push a kijelölt branchre.</w:t>
+      </w:r>
+    </w:p>
+    <w:p>
+      <w:pPr>
+        <w:pStyle w:val="ListParagraph"/>
+        <w:numPr>
+          <w:ilvl w:val="0"/>
+          <w:numId w:val="5"/>
+        </w:numPr>
+        <w:spacing w:after="80"/>
+      </w:pPr>
+      <w:r>
+        <w:t xml:space="preserve">Küldd el az Excelt a felhasználónak, és foglald össze a chatben (3.13).</w:t>
       </w:r>
     </w:p>
     <w:p>
@@ -817,7 +1058,7 @@
         <w:pStyle w:val="Heading2"/>
       </w:pPr>
       <w:r>
-        <w:t xml:space="preserve">3.6 Besorolási szabályok</w:t>
+        <w:t xml:space="preserve">3.7 Besorolási szabályok</w:t>
       </w:r>
     </w:p>
     <w:p>
@@ -1624,6 +1865,325 @@
         <w:pStyle w:val="Heading3"/>
       </w:pPr>
       <w:r>
+        <w:t xml:space="preserve">Termék illeszkedése a kategóriához</w:t>
+      </w:r>
+    </w:p>
+    <w:tbl>
+      <w:tblPr>
+        <w:tblW w:type="dxa" w:w="9026"/>
+        <w:tblBorders>
+          <w:top w:val="single" w:color="auto" w:sz="4"/>
+          <w:left w:val="single" w:color="auto" w:sz="4"/>
+          <w:bottom w:val="single" w:color="auto" w:sz="4"/>
+          <w:right w:val="single" w:color="auto" w:sz="4"/>
+          <w:insideH w:val="single" w:color="auto" w:sz="4"/>
+          <w:insideV w:val="single" w:color="auto" w:sz="4"/>
+        </w:tblBorders>
+      </w:tblPr>
+      <w:tblGrid>
+        <w:gridCol w:w="2200"/>
+        <w:gridCol w:w="6826"/>
+      </w:tblGrid>
+      <w:tr>
+        <w:trPr>
+          <w:tblHeader/>
+        </w:trPr>
+        <w:tc>
+          <w:tcPr>
+            <w:tcW w:type="dxa" w:w="2200"/>
+            <w:tcBorders>
+              <w:top w:val="single" w:color="BDBDBD" w:sz="4"/>
+              <w:left w:val="single" w:color="BDBDBD" w:sz="4"/>
+              <w:bottom w:val="single" w:color="BDBDBD" w:sz="4"/>
+              <w:right w:val="single" w:color="BDBDBD" w:sz="4"/>
+            </w:tcBorders>
+            <w:shd w:fill="2E7D32" w:color="auto" w:val="clear"/>
+            <w:tcMar>
+              <w:top w:type="dxa" w:w="60"/>
+              <w:left w:type="dxa" w:w="100"/>
+              <w:bottom w:type="dxa" w:w="60"/>
+              <w:right w:type="dxa" w:w="100"/>
+            </w:tcMar>
+          </w:tcPr>
+          <w:p>
+            <w:r>
+              <w:rPr>
+                <w:b/>
+                <w:bCs/>
+                <w:color w:val="FFFFFF"/>
+              </w:rPr>
+              <w:t xml:space="preserve">Érték</w:t>
+            </w:r>
+          </w:p>
+        </w:tc>
+        <w:tc>
+          <w:tcPr>
+            <w:tcW w:type="dxa" w:w="6826"/>
+            <w:tcBorders>
+              <w:top w:val="single" w:color="BDBDBD" w:sz="4"/>
+              <w:left w:val="single" w:color="BDBDBD" w:sz="4"/>
+              <w:bottom w:val="single" w:color="BDBDBD" w:sz="4"/>
+              <w:right w:val="single" w:color="BDBDBD" w:sz="4"/>
+            </w:tcBorders>
+            <w:shd w:fill="2E7D32" w:color="auto" w:val="clear"/>
+            <w:tcMar>
+              <w:top w:type="dxa" w:w="60"/>
+              <w:left w:type="dxa" w:w="100"/>
+              <w:bottom w:type="dxa" w:w="60"/>
+              <w:right w:type="dxa" w:w="100"/>
+            </w:tcMar>
+          </w:tcPr>
+          <w:p>
+            <w:r>
+              <w:rPr>
+                <w:b/>
+                <w:bCs/>
+                <w:color w:val="FFFFFF"/>
+              </w:rPr>
+              <w:t xml:space="preserve">Mikor</w:t>
+            </w:r>
+          </w:p>
+        </w:tc>
+      </w:tr>
+      <w:tr>
+        <w:trPr>
+          <w:tblHeader w:val="false"/>
+        </w:trPr>
+        <w:tc>
+          <w:tcPr>
+            <w:tcW w:type="dxa" w:w="2200"/>
+            <w:tcBorders>
+              <w:top w:val="single" w:color="BDBDBD" w:sz="4"/>
+              <w:left w:val="single" w:color="BDBDBD" w:sz="4"/>
+              <w:bottom w:val="single" w:color="BDBDBD" w:sz="4"/>
+              <w:right w:val="single" w:color="BDBDBD" w:sz="4"/>
+            </w:tcBorders>
+            <w:tcMar>
+              <w:top w:type="dxa" w:w="60"/>
+              <w:left w:type="dxa" w:w="100"/>
+              <w:bottom w:type="dxa" w:w="60"/>
+              <w:right w:type="dxa" w:w="100"/>
+            </w:tcMar>
+          </w:tcPr>
+          <w:p>
+            <w:r>
+              <w:rPr>
+                <w:b w:val="false"/>
+                <w:bCs w:val="false"/>
+              </w:rPr>
+              <w:t xml:space="preserve">Erős – elsődleges</w:t>
+            </w:r>
+          </w:p>
+        </w:tc>
+        <w:tc>
+          <w:tcPr>
+            <w:tcW w:type="dxa" w:w="6826"/>
+            <w:tcBorders>
+              <w:top w:val="single" w:color="BDBDBD" w:sz="4"/>
+              <w:left w:val="single" w:color="BDBDBD" w:sz="4"/>
+              <w:bottom w:val="single" w:color="BDBDBD" w:sz="4"/>
+              <w:right w:val="single" w:color="BDBDBD" w:sz="4"/>
+            </w:tcBorders>
+            <w:tcMar>
+              <w:top w:type="dxa" w:w="60"/>
+              <w:left w:type="dxa" w:w="100"/>
+              <w:bottom w:type="dxa" w:w="60"/>
+              <w:right w:type="dxa" w:w="100"/>
+            </w:tcMar>
+          </w:tcPr>
+          <w:p>
+            <w:r>
+              <w:rPr>
+                <w:b w:val="false"/>
+                <w:bCs w:val="false"/>
+              </w:rPr>
+              <w:t xml:space="preserve">A termék a kategória fő terméktípusa; ez a fő kategóriája.</w:t>
+            </w:r>
+          </w:p>
+        </w:tc>
+      </w:tr>
+      <w:tr>
+        <w:trPr>
+          <w:tblHeader w:val="false"/>
+        </w:trPr>
+        <w:tc>
+          <w:tcPr>
+            <w:tcW w:type="dxa" w:w="2200"/>
+            <w:tcBorders>
+              <w:top w:val="single" w:color="BDBDBD" w:sz="4"/>
+              <w:left w:val="single" w:color="BDBDBD" w:sz="4"/>
+              <w:bottom w:val="single" w:color="BDBDBD" w:sz="4"/>
+              <w:right w:val="single" w:color="BDBDBD" w:sz="4"/>
+            </w:tcBorders>
+            <w:tcMar>
+              <w:top w:type="dxa" w:w="60"/>
+              <w:left w:type="dxa" w:w="100"/>
+              <w:bottom w:type="dxa" w:w="60"/>
+              <w:right w:type="dxa" w:w="100"/>
+            </w:tcMar>
+          </w:tcPr>
+          <w:p>
+            <w:r>
+              <w:rPr>
+                <w:b w:val="false"/>
+                <w:bCs w:val="false"/>
+              </w:rPr>
+              <w:t xml:space="preserve">Erős – másodlagos</w:t>
+            </w:r>
+          </w:p>
+        </w:tc>
+        <w:tc>
+          <w:tcPr>
+            <w:tcW w:type="dxa" w:w="6826"/>
+            <w:tcBorders>
+              <w:top w:val="single" w:color="BDBDBD" w:sz="4"/>
+              <w:left w:val="single" w:color="BDBDBD" w:sz="4"/>
+              <w:bottom w:val="single" w:color="BDBDBD" w:sz="4"/>
+              <w:right w:val="single" w:color="BDBDBD" w:sz="4"/>
+            </w:tcBorders>
+            <w:tcMar>
+              <w:top w:type="dxa" w:w="60"/>
+              <w:left w:type="dxa" w:w="100"/>
+              <w:bottom w:type="dxa" w:w="60"/>
+              <w:right w:type="dxa" w:w="100"/>
+            </w:tcMar>
+          </w:tcPr>
+          <w:p>
+            <w:r>
+              <w:rPr>
+                <w:b w:val="false"/>
+                <w:bCs w:val="false"/>
+              </w:rPr>
+              <w:t xml:space="preserve">Fő terméktípus egy másik keresési szándékhoz is (pl. kis LED a Palántanevelő LED kategóriában).</w:t>
+            </w:r>
+          </w:p>
+        </w:tc>
+      </w:tr>
+      <w:tr>
+        <w:trPr>
+          <w:tblHeader w:val="false"/>
+        </w:trPr>
+        <w:tc>
+          <w:tcPr>
+            <w:tcW w:type="dxa" w:w="2200"/>
+            <w:tcBorders>
+              <w:top w:val="single" w:color="BDBDBD" w:sz="4"/>
+              <w:left w:val="single" w:color="BDBDBD" w:sz="4"/>
+              <w:bottom w:val="single" w:color="BDBDBD" w:sz="4"/>
+              <w:right w:val="single" w:color="BDBDBD" w:sz="4"/>
+            </w:tcBorders>
+            <w:tcMar>
+              <w:top w:type="dxa" w:w="60"/>
+              <w:left w:type="dxa" w:w="100"/>
+              <w:bottom w:type="dxa" w:w="60"/>
+              <w:right w:type="dxa" w:w="100"/>
+            </w:tcMar>
+          </w:tcPr>
+          <w:p>
+            <w:r>
+              <w:rPr>
+                <w:b w:val="false"/>
+                <w:bCs w:val="false"/>
+              </w:rPr>
+              <w:t xml:space="preserve">Laza</w:t>
+            </w:r>
+          </w:p>
+        </w:tc>
+        <w:tc>
+          <w:tcPr>
+            <w:tcW w:type="dxa" w:w="6826"/>
+            <w:tcBorders>
+              <w:top w:val="single" w:color="BDBDBD" w:sz="4"/>
+              <w:left w:val="single" w:color="BDBDBD" w:sz="4"/>
+              <w:bottom w:val="single" w:color="BDBDBD" w:sz="4"/>
+              <w:right w:val="single" w:color="BDBDBD" w:sz="4"/>
+            </w:tcBorders>
+            <w:tcMar>
+              <w:top w:type="dxa" w:w="60"/>
+              <w:left w:type="dxa" w:w="100"/>
+              <w:bottom w:type="dxa" w:w="60"/>
+              <w:right w:type="dxa" w:w="100"/>
+            </w:tcMar>
+          </w:tcPr>
+          <w:p>
+            <w:r>
+              <w:rPr>
+                <w:b w:val="false"/>
+                <w:bCs w:val="false"/>
+              </w:rPr>
+              <w:t xml:space="preserve">Kiegészítő vagy rokon termék, amit a kategória vásárlója is keres (pl. termosztát a fűtőlap mellett).</w:t>
+            </w:r>
+          </w:p>
+        </w:tc>
+      </w:tr>
+      <w:tr>
+        <w:trPr>
+          <w:tblHeader w:val="false"/>
+        </w:trPr>
+        <w:tc>
+          <w:tcPr>
+            <w:tcW w:type="dxa" w:w="2200"/>
+            <w:tcBorders>
+              <w:top w:val="single" w:color="BDBDBD" w:sz="4"/>
+              <w:left w:val="single" w:color="BDBDBD" w:sz="4"/>
+              <w:bottom w:val="single" w:color="BDBDBD" w:sz="4"/>
+              <w:right w:val="single" w:color="BDBDBD" w:sz="4"/>
+            </w:tcBorders>
+            <w:tcMar>
+              <w:top w:type="dxa" w:w="60"/>
+              <w:left w:type="dxa" w:w="100"/>
+              <w:bottom w:type="dxa" w:w="60"/>
+              <w:right w:type="dxa" w:w="100"/>
+            </w:tcMar>
+          </w:tcPr>
+          <w:p>
+            <w:r>
+              <w:rPr>
+                <w:b w:val="false"/>
+                <w:bCs w:val="false"/>
+              </w:rPr>
+              <w:t xml:space="preserve">Besorolatlan</w:t>
+            </w:r>
+          </w:p>
+        </w:tc>
+        <w:tc>
+          <w:tcPr>
+            <w:tcW w:type="dxa" w:w="6826"/>
+            <w:tcBorders>
+              <w:top w:val="single" w:color="BDBDBD" w:sz="4"/>
+              <w:left w:val="single" w:color="BDBDBD" w:sz="4"/>
+              <w:bottom w:val="single" w:color="BDBDBD" w:sz="4"/>
+              <w:right w:val="single" w:color="BDBDBD" w:sz="4"/>
+            </w:tcBorders>
+            <w:tcMar>
+              <w:top w:type="dxa" w:w="60"/>
+              <w:left w:type="dxa" w:w="100"/>
+              <w:bottom w:type="dxa" w:w="60"/>
+              <w:right w:type="dxa" w:w="100"/>
+            </w:tcMar>
+          </w:tcPr>
+          <w:p>
+            <w:r>
+              <w:rPr>
+                <w:b w:val="false"/>
+                <w:bCs w:val="false"/>
+              </w:rPr>
+              <w:t xml:space="preserve">Egyik javasolt kategóriába sem illik – indoklással a Termékkínálat lapon.</w:t>
+            </w:r>
+          </w:p>
+        </w:tc>
+      </w:tr>
+    </w:tbl>
+    <w:p>
+      <w:pPr>
+        <w:spacing w:after="120"/>
+      </w:pPr>
+    </w:p>
+    <w:p>
+      <w:pPr>
+        <w:pStyle w:val="Heading3"/>
+      </w:pPr>
+      <w:r>
         <w:t xml:space="preserve">Színkódok (minden lapon)</w:t>
       </w:r>
     </w:p>
@@ -1697,7 +2257,7 @@
         <w:pStyle w:val="Heading2"/>
       </w:pPr>
       <w:r>
-        <w:t xml:space="preserve">3.7 Az Excel szerkezete</w:t>
+        <w:t xml:space="preserve">3.8 Az Excel szerkezete</w:t>
       </w:r>
     </w:p>
     <w:p>
@@ -1837,7 +2397,7 @@
                 <w:b w:val="false"/>
                 <w:bCs w:val="false"/>
               </w:rPr>
-              <w:t xml:space="preserve">Cím, forrássor (fiók, dátum, hely, nyelv, hálózat). Táblázat: Kategória (menünév) · Fő kulcsszó · Fő kulcsszó havi (SUMIFS az Összes kulcsszó lapról) · Klaszter összesen, érdemes = Igen (SUMIFS) · Kötődés · Érdemes rá kategória? · Felhasználási terület · Javasolt hely az új fában. Alatta jelmagyarázat és a fő megállapítások.</w:t>
+              <w:t xml:space="preserve">Cím, forrássor (fiók, dátum, hely, nyelv, hálózat, termékexport dátuma). Táblázat: Kategória (javasolt menünév) · Fő kulcsszó · Fő kulcsszó havi (SUMIFS az Összes kulcsszó lapról) · Klaszter összesen, érdemes = Igen (SUMIFS) · Kötődés · Érdemes rá kategória? · Felhasználási terület · Javasolt hely az új fában · Termékek száma. Alatta jelmagyarázat és a fő megállapítások.</w:t>
             </w:r>
           </w:p>
         </w:tc>
@@ -1925,7 +2485,7 @@
                 <w:b w:val="false"/>
                 <w:bCs w:val="false"/>
               </w:rPr>
-              <w:t xml:space="preserve">Régi kategóriák / Jelenlegi menünevek</w:t>
+              <w:t xml:space="preserve">Kategóriaszerkezet-ajánlás</w:t>
             </w:r>
           </w:p>
         </w:tc>
@@ -1951,7 +2511,7 @@
                 <w:b w:val="false"/>
                 <w:bCs w:val="false"/>
               </w:rPr>
-              <w:t xml:space="preserve">Minden régi vagy jelenlegi menünév: a saját keresése, és javaslat arra, hova kerüljön vagy mi legyen az új neve.</w:t>
+              <w:t xml:space="preserve">A javasolt fa a termékkínálat és a kulcsszavak alapján: Szint (1/2/3) · Javasolt kategórianév (menünév) · Szülőkategória · Fő kulcsszó · Havi · Klaszter összesen · Kulcsszó-kötődés (erősen / lazán kapcsolódik) · Termékek száma · Típus (önálló kategória / szűrő / navigációs kategória / hub-csempe) · Indoklás. Alatta: ami NE legyen kategória, és miért.</w:t>
             </w:r>
           </w:p>
         </w:tc>
@@ -1982,7 +2542,7 @@
                 <w:b w:val="false"/>
                 <w:bCs w:val="false"/>
               </w:rPr>
-              <w:t xml:space="preserve">Összes kulcsszó</w:t>
+              <w:t xml:space="preserve">Termékkínálat</w:t>
             </w:r>
           </w:p>
         </w:tc>
@@ -2008,7 +2568,7 @@
                 <w:b w:val="false"/>
                 <w:bCs w:val="false"/>
               </w:rPr>
-              <w:t xml:space="preserve">Kategória · # · Kulcsszó · Megjegyzés (szint – a felhasználó tölti) · Havi keresés · Kötődés · Érdemes · Felhasználási terület · Javasolt felhasználás. Volumen szerint csökkenő sorrend, autoszűrő, rögzített fejléc.</w:t>
+              <w:t xml:space="preserve">A főkategória témájába válogatott összes termék: Termékkód · Terméknév · Gyártó · Gyűjtőtermék (GYUJTO…) · Elsődleges javasolt kategória · További kategóriák · Illeszkedés (Erős / Laza) · Megjegyzés. A Besorolatlan termékek is itt vannak, indoklással.</w:t>
             </w:r>
           </w:p>
         </w:tc>
@@ -2039,7 +2599,7 @@
                 <w:b w:val="false"/>
                 <w:bCs w:val="false"/>
               </w:rPr>
-              <w:t xml:space="preserve">Kategórialapok (1, 2, …)</w:t>
+              <w:t xml:space="preserve">Régi kategóriák</w:t>
             </w:r>
           </w:p>
         </w:tc>
@@ -2065,7 +2625,7 @@
                 <w:b w:val="false"/>
                 <w:bCs w:val="false"/>
               </w:rPr>
-              <w:t xml:space="preserve">Fejrész: „[Kategória] – fő kulcsszó: „…””, felhasználási terület, megjegyzés, a felvett kulcsszavak száma. Táblázat a 6. sortól: # · Kulcsszó · Havi keresés · Kötődés · Érdemes · Felhasználási terület · Javasolt felhasználás. Az 1. sor a fő kulcsszó, a többi volumen szerint csökkenő. Kategóriánként legfeljebb ~30 kulcsszó. Utolsó sor: „Összesen (érdemes rá oldal = Igen)” SUMIFS-szel.</w:t>
+              <w:t xml:space="preserve">Csak ha a felhasználó kifejezetten kéri: a régi nevek keresése tájékoztatásként (pl. 301-es átirányításhoz). A javaslatot nem befolyásolhatja.</w:t>
             </w:r>
           </w:p>
         </w:tc>
@@ -2096,6 +2656,120 @@
                 <w:b w:val="false"/>
                 <w:bCs w:val="false"/>
               </w:rPr>
+              <w:t xml:space="preserve">Összes kulcsszó</w:t>
+            </w:r>
+          </w:p>
+        </w:tc>
+        <w:tc>
+          <w:tcPr>
+            <w:tcW w:type="dxa" w:w="6426"/>
+            <w:tcBorders>
+              <w:top w:val="single" w:color="BDBDBD" w:sz="4"/>
+              <w:left w:val="single" w:color="BDBDBD" w:sz="4"/>
+              <w:bottom w:val="single" w:color="BDBDBD" w:sz="4"/>
+              <w:right w:val="single" w:color="BDBDBD" w:sz="4"/>
+            </w:tcBorders>
+            <w:tcMar>
+              <w:top w:type="dxa" w:w="60"/>
+              <w:left w:type="dxa" w:w="100"/>
+              <w:bottom w:type="dxa" w:w="60"/>
+              <w:right w:type="dxa" w:w="100"/>
+            </w:tcMar>
+          </w:tcPr>
+          <w:p>
+            <w:r>
+              <w:rPr>
+                <w:b w:val="false"/>
+                <w:bCs w:val="false"/>
+              </w:rPr>
+              <w:t xml:space="preserve">Kategória · # · Kulcsszó · Megjegyzés (szint – a felhasználó tölti) · Havi keresés · Kötődés · Érdemes · Felhasználási terület · Javasolt felhasználás. Volumen szerint csökkenő sorrend, autoszűrő, rögzített fejléc.</w:t>
+            </w:r>
+          </w:p>
+        </w:tc>
+      </w:tr>
+      <w:tr>
+        <w:trPr>
+          <w:tblHeader w:val="false"/>
+        </w:trPr>
+        <w:tc>
+          <w:tcPr>
+            <w:tcW w:type="dxa" w:w="2600"/>
+            <w:tcBorders>
+              <w:top w:val="single" w:color="BDBDBD" w:sz="4"/>
+              <w:left w:val="single" w:color="BDBDBD" w:sz="4"/>
+              <w:bottom w:val="single" w:color="BDBDBD" w:sz="4"/>
+              <w:right w:val="single" w:color="BDBDBD" w:sz="4"/>
+            </w:tcBorders>
+            <w:tcMar>
+              <w:top w:type="dxa" w:w="60"/>
+              <w:left w:type="dxa" w:w="100"/>
+              <w:bottom w:type="dxa" w:w="60"/>
+              <w:right w:type="dxa" w:w="100"/>
+            </w:tcMar>
+          </w:tcPr>
+          <w:p>
+            <w:r>
+              <w:rPr>
+                <w:b w:val="false"/>
+                <w:bCs w:val="false"/>
+              </w:rPr>
+              <w:t xml:space="preserve">Kategórialapok – minden javasolt kategóriának külön lap (1, 2, …)</w:t>
+            </w:r>
+          </w:p>
+        </w:tc>
+        <w:tc>
+          <w:tcPr>
+            <w:tcW w:type="dxa" w:w="6426"/>
+            <w:tcBorders>
+              <w:top w:val="single" w:color="BDBDBD" w:sz="4"/>
+              <w:left w:val="single" w:color="BDBDBD" w:sz="4"/>
+              <w:bottom w:val="single" w:color="BDBDBD" w:sz="4"/>
+              <w:right w:val="single" w:color="BDBDBD" w:sz="4"/>
+            </w:tcBorders>
+            <w:tcMar>
+              <w:top w:type="dxa" w:w="60"/>
+              <w:left w:type="dxa" w:w="100"/>
+              <w:bottom w:type="dxa" w:w="60"/>
+              <w:right w:type="dxa" w:w="100"/>
+            </w:tcMar>
+          </w:tcPr>
+          <w:p>
+            <w:r>
+              <w:rPr>
+                <w:b w:val="false"/>
+                <w:bCs w:val="false"/>
+              </w:rPr>
+              <w:t xml:space="preserve">Fejrész: „[Kategória] – fő kulcsszó: „…””, felhasználási terület, megjegyzés, a felvett kulcsszavak és termékek száma. 1. blokk – Kulcsszavak: # · Kulcsszó · Havi keresés · Kötődés · Érdemes · Felhasználási terület · Javasolt felhasználás; az 1. sor a fő kulcsszó, a többi volumen szerint csökkenő, legfeljebb ~30 kulcsszó, végén „Összesen (érdemes rá oldal = Igen)” SUMIFS-szel. 2. blokk – Termékek: az összes ide illő termék a jelenlegi kínálatból: Termékkód · Terméknév · Elsődleges / másodlagos · Illeszkedés (Erős / Laza) · Megjegyzés. Egy termék több kategórialapon is szerepelhet.</w:t>
+            </w:r>
+          </w:p>
+        </w:tc>
+      </w:tr>
+      <w:tr>
+        <w:trPr>
+          <w:tblHeader w:val="false"/>
+        </w:trPr>
+        <w:tc>
+          <w:tcPr>
+            <w:tcW w:type="dxa" w:w="2600"/>
+            <w:tcBorders>
+              <w:top w:val="single" w:color="BDBDBD" w:sz="4"/>
+              <w:left w:val="single" w:color="BDBDBD" w:sz="4"/>
+              <w:bottom w:val="single" w:color="BDBDBD" w:sz="4"/>
+              <w:right w:val="single" w:color="BDBDBD" w:sz="4"/>
+            </w:tcBorders>
+            <w:tcMar>
+              <w:top w:type="dxa" w:w="60"/>
+              <w:left w:type="dxa" w:w="100"/>
+              <w:bottom w:type="dxa" w:w="60"/>
+              <w:right w:type="dxa" w:w="100"/>
+            </w:tcMar>
+          </w:tcPr>
+          <w:p>
+            <w:r>
+              <w:rPr>
+                <w:b w:val="false"/>
+                <w:bCs w:val="false"/>
+              </w:rPr>
               <w:t xml:space="preserve">Gyártói kulcsszavak</w:t>
             </w:r>
           </w:p>
@@ -2164,15 +2838,15 @@
         <w:pStyle w:val="Heading2"/>
       </w:pPr>
       <w:r>
-        <w:t xml:space="preserve">3.8 Kategórianév- és alkategória-ajánlás szabályai</w:t>
-      </w:r>
-    </w:p>
-    <w:p>
-      <w:pPr>
-        <w:pStyle w:val="ListParagraph"/>
-        <w:numPr>
-          <w:ilvl w:val="0"/>
-          <w:numId w:val="5"/>
+        <w:t xml:space="preserve">3.9 Kategórianév- és alkategória-ajánlás szabályai</w:t>
+      </w:r>
+    </w:p>
+    <w:p>
+      <w:pPr>
+        <w:pStyle w:val="ListParagraph"/>
+        <w:numPr>
+          <w:ilvl w:val="0"/>
+          <w:numId w:val="6"/>
         </w:numPr>
         <w:spacing w:after="80"/>
       </w:pPr>
@@ -2185,7 +2859,7 @@
         <w:pStyle w:val="ListParagraph"/>
         <w:numPr>
           <w:ilvl w:val="0"/>
-          <w:numId w:val="5"/>
+          <w:numId w:val="6"/>
         </w:numPr>
         <w:spacing w:after="80"/>
       </w:pPr>
@@ -2198,7 +2872,7 @@
         <w:pStyle w:val="ListParagraph"/>
         <w:numPr>
           <w:ilvl w:val="0"/>
-          <w:numId w:val="5"/>
+          <w:numId w:val="6"/>
         </w:numPr>
         <w:spacing w:after="80"/>
       </w:pPr>
@@ -2211,7 +2885,7 @@
         <w:pStyle w:val="ListParagraph"/>
         <w:numPr>
           <w:ilvl w:val="0"/>
-          <w:numId w:val="5"/>
+          <w:numId w:val="6"/>
         </w:numPr>
         <w:spacing w:after="80"/>
       </w:pPr>
@@ -2224,7 +2898,7 @@
         <w:pStyle w:val="ListParagraph"/>
         <w:numPr>
           <w:ilvl w:val="0"/>
-          <w:numId w:val="5"/>
+          <w:numId w:val="6"/>
         </w:numPr>
         <w:spacing w:after="80"/>
       </w:pPr>
@@ -2237,20 +2911,33 @@
         <w:pStyle w:val="ListParagraph"/>
         <w:numPr>
           <w:ilvl w:val="0"/>
-          <w:numId w:val="5"/>
-        </w:numPr>
-        <w:spacing w:after="80"/>
-      </w:pPr>
-      <w:r>
-        <w:t xml:space="preserve">A régi kategórianevek keresését is mutasd meg, és mondd meg, hova kerüljenek (új alkategória, másik főkategória, átirányítás).</w:t>
-      </w:r>
-    </w:p>
-    <w:p>
-      <w:pPr>
-        <w:pStyle w:val="ListParagraph"/>
-        <w:numPr>
-          <w:ilvl w:val="0"/>
-          <w:numId w:val="5"/>
+          <w:numId w:val="6"/>
+        </w:numPr>
+        <w:spacing w:after="80"/>
+      </w:pPr>
+      <w:r>
+        <w:t xml:space="preserve">Az éles oldal jelenlegi kategórianeveit és szerkezetét ne használd kiindulópontnak, és ne igazodj hozzájuk. A javaslat a termékkínálatból (milyen terméktípusok vannak, hány termék) és a kulcsszóadatból (mire és mennyien keresnek) együtt áll össze.</w:t>
+      </w:r>
+    </w:p>
+    <w:p>
+      <w:pPr>
+        <w:pStyle w:val="ListParagraph"/>
+        <w:numPr>
+          <w:ilvl w:val="0"/>
+          <w:numId w:val="6"/>
+        </w:numPr>
+        <w:spacing w:after="80"/>
+      </w:pPr>
+      <w:r>
+        <w:t xml:space="preserve">Csak olyan kategóriát javasolj, amelyhez van termék a kínálatban. A termék nélküli, de keresett témák a Bővítés lapra kerülnek, kínálatbővítési lehetőségként.</w:t>
+      </w:r>
+    </w:p>
+    <w:p>
+      <w:pPr>
+        <w:pStyle w:val="ListParagraph"/>
+        <w:numPr>
+          <w:ilvl w:val="0"/>
+          <w:numId w:val="6"/>
         </w:numPr>
         <w:spacing w:after="80"/>
       </w:pPr>
@@ -2263,7 +2950,7 @@
         <w:pStyle w:val="ListParagraph"/>
         <w:numPr>
           <w:ilvl w:val="0"/>
-          <w:numId w:val="5"/>
+          <w:numId w:val="6"/>
         </w:numPr>
         <w:spacing w:after="80"/>
       </w:pPr>
@@ -2276,7 +2963,7 @@
         <w:pStyle w:val="ListParagraph"/>
         <w:numPr>
           <w:ilvl w:val="0"/>
-          <w:numId w:val="5"/>
+          <w:numId w:val="6"/>
         </w:numPr>
         <w:spacing w:after="80"/>
       </w:pPr>
@@ -2289,15 +2976,15 @@
         <w:pStyle w:val="Heading2"/>
       </w:pPr>
       <w:r>
-        <w:t xml:space="preserve">3.9 Kannibalizáció – szabályok</w:t>
-      </w:r>
-    </w:p>
-    <w:p>
-      <w:pPr>
-        <w:pStyle w:val="ListParagraph"/>
-        <w:numPr>
-          <w:ilvl w:val="0"/>
-          <w:numId w:val="6"/>
+        <w:t xml:space="preserve">3.10 Kannibalizáció – szabályok</w:t>
+      </w:r>
+    </w:p>
+    <w:p>
+      <w:pPr>
+        <w:pStyle w:val="ListParagraph"/>
+        <w:numPr>
+          <w:ilvl w:val="0"/>
+          <w:numId w:val="7"/>
         </w:numPr>
         <w:spacing w:after="80"/>
       </w:pPr>
@@ -2310,7 +2997,7 @@
         <w:pStyle w:val="ListParagraph"/>
         <w:numPr>
           <w:ilvl w:val="0"/>
-          <w:numId w:val="6"/>
+          <w:numId w:val="7"/>
         </w:numPr>
         <w:spacing w:after="80"/>
       </w:pPr>
@@ -2323,7 +3010,7 @@
         <w:pStyle w:val="ListParagraph"/>
         <w:numPr>
           <w:ilvl w:val="0"/>
-          <w:numId w:val="6"/>
+          <w:numId w:val="7"/>
         </w:numPr>
         <w:spacing w:after="80"/>
       </w:pPr>
@@ -2336,7 +3023,7 @@
         <w:pStyle w:val="ListParagraph"/>
         <w:numPr>
           <w:ilvl w:val="0"/>
-          <w:numId w:val="6"/>
+          <w:numId w:val="7"/>
         </w:numPr>
         <w:spacing w:after="80"/>
       </w:pPr>
@@ -2349,7 +3036,7 @@
         <w:pStyle w:val="ListParagraph"/>
         <w:numPr>
           <w:ilvl w:val="0"/>
-          <w:numId w:val="6"/>
+          <w:numId w:val="7"/>
         </w:numPr>
         <w:spacing w:after="80"/>
       </w:pPr>
@@ -2362,7 +3049,7 @@
         <w:pStyle w:val="ListParagraph"/>
         <w:numPr>
           <w:ilvl w:val="0"/>
-          <w:numId w:val="6"/>
+          <w:numId w:val="7"/>
         </w:numPr>
         <w:spacing w:after="80"/>
       </w:pPr>
@@ -2375,7 +3062,7 @@
         <w:pStyle w:val="ListParagraph"/>
         <w:numPr>
           <w:ilvl w:val="0"/>
-          <w:numId w:val="6"/>
+          <w:numId w:val="7"/>
         </w:numPr>
         <w:spacing w:after="80"/>
       </w:pPr>
@@ -2388,7 +3075,7 @@
         <w:pStyle w:val="Heading2"/>
       </w:pPr>
       <w:r>
-        <w:t xml:space="preserve">3.10 Terméknév-séma</w:t>
+        <w:t xml:space="preserve">3.11 Terméknév-séma</w:t>
       </w:r>
     </w:p>
     <w:p>
@@ -2448,7 +3135,7 @@
         <w:pStyle w:val="Heading2"/>
       </w:pPr>
       <w:r>
-        <w:t xml:space="preserve">3.11 Gyűjtőoldal (hub) kategória</w:t>
+        <w:t xml:space="preserve">3.12 Gyűjtőoldal (hub) kategória</w:t>
       </w:r>
     </w:p>
     <w:p>
@@ -2508,7 +3195,7 @@
         <w:pStyle w:val="Heading2"/>
       </w:pPr>
       <w:r>
-        <w:t xml:space="preserve">3.12 Kommunikáció és kimenet</w:t>
+        <w:t xml:space="preserve">3.13 Kommunikáció és kimenet</w:t>
       </w:r>
     </w:p>
     <w:p>
@@ -2534,7 +3221,7 @@
         <w:spacing w:after="60"/>
       </w:pPr>
       <w:r>
-        <w:t xml:space="preserve">Az eredmény-összefoglaló a chatben: forrás (fiók, dátum, beállítások, lekérdezések és kulcsszavak száma), egy táblázat a fő megállapításokkal (menünév, fő kulcsszó, havi, klaszter, javaslat), a félrevezető nagy számok listája, és hogy mi nem sikerült.</w:t>
+        <w:t xml:space="preserve">Az eredmény-összefoglaló a chatben: forrás (fiók, dátum, beállítások, lekérdezések és kulcsszavak száma), egy táblázat a javasolt kategóriaszerkezettel (menünév, fő kulcsszó, havi, klaszter, termékek száma, javaslat), a besorolatlan termékek száma, a félrevezető nagy számok listája, és hogy mi nem sikerült.</w:t>
       </w:r>
     </w:p>
     <w:p>
@@ -2581,20 +3268,20 @@
         <w:pStyle w:val="Heading2"/>
       </w:pPr>
       <w:r>
-        <w:t xml:space="preserve">3.13 Ismert korlátok</w:t>
-      </w:r>
-    </w:p>
-    <w:p>
-      <w:pPr>
-        <w:pStyle w:val="ListParagraph"/>
-        <w:numPr>
-          <w:ilvl w:val="0"/>
-          <w:numId w:val="2"/>
-        </w:numPr>
-        <w:spacing w:after="60"/>
-      </w:pPr>
-      <w:r>
-        <w:t xml:space="preserve">A felhőkonténer nem éri el a Shoprenter API-t és a babylon-grow.eu oldalt (egress 403). A terméklistát és a sandbox-fát exportként (CSV) vagy képernyőképként kell kérni. Addig az „Érdemes” oszlop a keresési szándékon alapul.</w:t>
+        <w:t xml:space="preserve">3.14 Ismert korlátok</w:t>
+      </w:r>
+    </w:p>
+    <w:p>
+      <w:pPr>
+        <w:pStyle w:val="ListParagraph"/>
+        <w:numPr>
+          <w:ilvl w:val="0"/>
+          <w:numId w:val="2"/>
+        </w:numPr>
+        <w:spacing w:after="60"/>
+      </w:pPr>
+      <w:r>
+        <w:t xml:space="preserve">A felhőkonténer nem éri el a Shoprenter API-t és a babylon-grow.eu oldalt (egress 403). A teljes termékexportot (CSV: termékkód, terméknév, gyártó, gyűjtőtermék) és a sandbox-fát a felhasználótól kell kérni – a C:\shoprenter-auto\ scriptekkel a saját gépén tudja lefuttatni. Termékexport nélkül a termékes lapok nem készíthetők el; ezt az elején jelezni kell.</w:t>
       </w:r>
     </w:p>
     <w:p>
@@ -2629,6 +3316,19 @@
       </w:pPr>
       <w:r>
         <w:t xml:space="preserve">Repó: shoprenter-auto-claude-code-kategoria-javitas; memória: CLAUDE.md.</w:t>
+      </w:r>
+    </w:p>
+    <w:p>
+      <w:pPr>
+        <w:pStyle w:val="ListParagraph"/>
+        <w:numPr>
+          <w:ilvl w:val="0"/>
+          <w:numId w:val="2"/>
+        </w:numPr>
+        <w:spacing w:after="60"/>
+      </w:pPr>
+      <w:r>
+        <w:t xml:space="preserve">A termékes lapokhoz (Kategóriaszerkezet-ajánlás, Termékkínálat, a kategórialapok termékblokkja) a generátort az első termékexport beérkezésekor bővíteni kell: a konfiguráció kategóriánként a termékkódok listáját is tartalmazza, és a build leáll, ha egy termékkód nincs az exportban.</w:t>
       </w:r>
     </w:p>
     <w:p>
@@ -2917,6 +3617,18 @@
     </w:lvl>
   </w:abstractNum>
   <w:abstractNum w:abstractNumId="6" w15:restartNumberingAfterBreak="0">
+    <w:multiLevelType w:val="hybridMultilevel"/>
+    <w:lvl w:ilvl="0" w15:tentative="1">
+      <w:start w:val="1"/>
+      <w:numFmt w:val="decimal"/>
+      <w:lvlText w:val="%1."/>
+      <w:lvlJc w:val="left"/>
+      <w:pPr>
+        <w:ind w:left="540" w:hanging="360"/>
+      </w:pPr>
+    </w:lvl>
+  </w:abstractNum>
+  <w:abstractNum w:abstractNumId="7" w15:restartNumberingAfterBreak="0">
     <w:multiLevelType w:val="hybridMultilevel"/>
     <w:lvl w:ilvl="0" w15:tentative="1">
       <w:start w:val="1"/>
@@ -2960,6 +3672,12 @@
   </w:num>
   <w:num w:numId="6">
     <w:abstractNumId w:val="6"/>
+    <w:lvlOverride w:ilvl="0">
+      <w:startOverride w:val="1"/>
+    </w:lvlOverride>
+  </w:num>
+  <w:num w:numId="7">
+    <w:abstractNumId w:val="7"/>
     <w:lvlOverride w:ilvl="0">
       <w:startOverride w:val="1"/>
     </w:lvlOverride>

</xml_diff>